<commit_message>
fix: remove bullet points and empty list from guidance detail
</commit_message>
<xml_diff>
--- a/template_kyunyu_report.docx
+++ b/template_kyunyu_report.docx
@@ -1730,10 +1730,6 @@
           </w:p>
           <w:p>
             <w:pPr>
-              <w:numPr>
-                <w:ilvl w:val="0"/>
-                <w:numId w:val="3"/>
-              </w:numPr>
               <w:jc w:val="left"/>
               <w:rPr>
                 <w:rFonts w:asciiTheme="majorEastAsia" w:eastAsiaTheme="majorEastAsia" w:hAnsiTheme="majorEastAsia"/>
@@ -1750,29 +1746,6 @@
                 <w:szCs w:val="21"/>
               </w:rPr>
               <w:t>{{ guidance_detail }}</w:t>
-            </w:r>
-          </w:p>
-          <w:p>
-            <w:pPr>
-              <w:numPr>
-                <w:ilvl w:val="0"/>
-                <w:numId w:val="3"/>
-              </w:numPr>
-              <w:jc w:val="left"/>
-              <w:rPr>
-                <w:rFonts w:asciiTheme="majorEastAsia" w:eastAsiaTheme="majorEastAsia" w:hAnsiTheme="majorEastAsia" w:hint="eastAsia"/>
-                <w:b/>
-                <w:bCs/>
-                <w:szCs w:val="21"/>
-              </w:rPr>
-            </w:pPr>
-            <w:r>
-              <w:rPr>
-                <w:rFonts w:asciiTheme="majorEastAsia" w:eastAsiaTheme="majorEastAsia" w:hAnsiTheme="majorEastAsia"/>
-                <w:b/>
-                <w:bCs/>
-                <w:szCs w:val="21"/>
-              </w:rPr>
             </w:r>
           </w:p>
         </w:tc>

</xml_diff>